<commit_message>
BPP: renumber all figures/tables by first-appearance order (Fig 1-7, Table 1-11)
Co-Authored-By: Tatsuki Onishi <bougtoir@gmail.com>
</commit_message>
<xml_diff>
--- a/medical_accident_its_analysis/manuscript/bpp_manuscript_en.docx
+++ b/medical_accident_its_analysis/manuscript/bpp_manuscript_en.docx
@@ -192,7 +192,7 @@
           <w:i w:val="0"/>
           <w:sz w:val="24"/>
         </w:rPr>
-        <w:t>Physician counts use the principal-specialty classification; broad categories were matched to the Supreme Court's specialty labels, and subspecialties were aggregated in code. Because the Court assigns multi-specialty cases to a single principal specialty and states that the counts do not represent the intrinsic risk of each specialty, we treat litigation as an exposure signal rather than a measure of incident risk. (Supreme Court of Japan, 2024) We distinguish litigation from the Medical Accident Investigation System, which began in 2015 and covers only deaths and stillbirths judged unforeseen by the hospital administrator; it is not a general incident-reporting system and is not used as an exposure here. (Medical Accident Investigation System, 2015) Primary data sources and their resolution are summarised in Table 3.</w:t>
+        <w:t>Physician counts use the principal-specialty classification; broad categories were matched to the Supreme Court's specialty labels, and subspecialties were aggregated in code. Because the Court assigns multi-specialty cases to a single principal specialty and states that the counts do not represent the intrinsic risk of each specialty, we treat litigation as an exposure signal rather than a measure of incident risk. (Supreme Court of Japan, 2024) We distinguish litigation from the Medical Accident Investigation System, which began in 2015 and covers only deaths and stillbirths judged unforeseen by the hospital administrator; it is not a general incident-reporting system and is not used as an exposure here. (Medical Accident Investigation System, 2015) Primary data sources and their resolution are summarised in Table 1.</w:t>
       </w:r>
     </w:p>
     <w:p>
@@ -232,7 +232,7 @@
           <w:i w:val="0"/>
           <w:sz w:val="24"/>
         </w:rPr>
-        <w:t>We used a transparent sensitivity-analysis framework that varies the exposure definition (counts versus rates), panel frequency (measured biennial waves versus interpolated annual values), and potential confounders while holding the specialty-level panel structure constant. Figure 5 summarises the framework. The exposure was the litigation rate, defined as closed claims per 1,000 physicians in each specialty-year, which removes specialty-size confounding because large specialties generate more claims for reasons unrelated to per-physician risk. The primary analysis used the 9 measured biennial physician waves (2008-2024). For each specialty we computed the biennial log-change in physicians (and, separately, in hospital facility counts) and regressed it on the lagged litigation rate at the start of the interval, in a panel with specialty and wave fixed effects, clustered standard errors, and a JOCS-CP indicator for obstetrics and gynaecology from 2009 onward. (Angrist and Pischke, 2009) Clusters are defined by specialty, so G=12 and the small-cluster correction uses a t-distribution with G-1 degrees of freedom. (Cameron and Miller, 2015) The primary estimating equation, for specialty s and wave t, was as follows.</w:t>
+        <w:t>We used a transparent sensitivity-analysis framework that varies the exposure definition (counts versus rates), panel frequency (measured biennial waves versus interpolated annual values), and potential confounders while holding the specialty-level panel structure constant. Figure 1 summarises the framework. The exposure was the litigation rate, defined as closed claims per 1,000 physicians in each specialty-year, which removes specialty-size confounding because large specialties generate more claims for reasons unrelated to per-physician risk. The primary analysis used the 9 measured biennial physician waves (2008-2024). For each specialty we computed the biennial log-change in physicians (and, separately, in hospital facility counts) and regressed it on the lagged litigation rate at the start of the interval, in a panel with specialty and wave fixed effects, clustered standard errors, and a JOCS-CP indicator for obstetrics and gynaecology from 2009 onward. (Angrist and Pischke, 2009) Clusters are defined by specialty, so G=12 and the small-cluster correction uses a t-distribution with G-1 degrees of freedom. (Cameron and Miller, 2015) The primary estimating equation, for specialty s and wave t, was as follows.</w:t>
       </w:r>
     </w:p>
     <w:p>
@@ -412,7 +412,7 @@
           <w:i w:val="0"/>
           <w:sz w:val="24"/>
         </w:rPr>
-        <w:t>All confidence intervals and two-sided p-values use the small-cluster correction with G-1 = 11 degrees of freedom. (Cameron and Miller, 2015) The JOCS-CP indicator captures the post-2009 obstetrics-and-gynaecology period. (JOCS-CP, 2009) Sensitivity analyses repeat the models on the annual hospital series, an interpolated annual-physician series, raw counts instead of rates, and annual hospital series controlling for the JMSR report rate (2016-2024) or total Nikkei Telecom article counts (2009-2018); details are in Table 3. The JOCS-CP indicator and all sensitivity models are exploratory; we report raw and Holm step-down adjusted p-values. Code and data are available in the accompanying repository (URL omitted for anonymised peer review).</w:t>
+        <w:t>All confidence intervals and two-sided p-values use the small-cluster correction with G-1 = 11 degrees of freedom. (Cameron and Miller, 2015) The JOCS-CP indicator captures the post-2009 obstetrics-and-gynaecology period. (JOCS-CP, 2009) Sensitivity analyses repeat the models on the annual hospital series, an interpolated annual-physician series, raw counts instead of rates, and annual hospital series controlling for the JMSR report rate (2016-2024) or total Nikkei Telecom article counts (2009-2018); details are in Table 1. The JOCS-CP indicator and all sensitivity models are exploratory; we report raw and Holm step-down adjusted p-values. Code and data are available in the accompanying repository (URL omitted for anonymised peer review).</w:t>
       </w:r>
     </w:p>
     <w:p>
@@ -450,7 +450,7 @@
           <w:i w:val="0"/>
           <w:sz w:val="24"/>
         </w:rPr>
-        <w:t>Litigation rates per 1,000 physicians varied several-fold across specialties and fell over time in 10 of 12 fields (Figure 6). Over the same period the physician workforce grew in 11 of 12 specialties (Figure 7; Table 1); the only exception was general surgery, which was nearly flat (-2.3% across 16 years). Exposure and workforce did not move in opposite directions as a flight-from-risk account would predict.</w:t>
+        <w:t>Litigation rates per 1,000 physicians varied several-fold across specialties and fell over time in 10 of 12 fields (Figure 2). Over the same period the physician workforce grew in 11 of 12 specialties (Figure 3; Table 2); the only exception was general surgery, which was nearly flat (-2.3% across 16 years). Exposure and workforce did not move in opposite directions as a flight-from-risk account would predict.</w:t>
       </w:r>
     </w:p>
     <w:p>
@@ -476,7 +476,7 @@
           <w:i w:val="0"/>
           <w:sz w:val="24"/>
         </w:rPr>
-        <w:t>The lagged litigation rate was not associated with biennial physician growth (coefficient -0.0009; 95% CI -0.0043 to +0.0025; p=0.56; n=96) or with hospital facility-count growth (coefficient +0.0003; p=0.90). Equivalence testing (Figure 1; Table 2) showed that a 1-SD higher litigation rate changed biennial physician growth by less than +/-1% (TOST p=0.023; point estimate -0.21% with 90% CI -0.84% to +0.42%). For hospital facility-count growth the point estimate was +0.07% (90% CI -0.91% to +1.06%): it was within the +/-2% margin (p=0.002) but not the stricter +/-1% margin (p=0.059). Thus the data are consistent with the absence of a policy-relevant effect on physician growth, and with at most a small effect on hospital facility-count growth. Detailed TOST results by margin are reported in Table 4.</w:t>
+        <w:t>The lagged litigation rate was not associated with biennial physician growth (coefficient -0.0009; 95% CI -0.0043 to +0.0025; p=0.56; n=96) or with hospital facility-count growth (coefficient +0.0003; p=0.90). Equivalence testing (Figure 4; Table 3) showed that a 1-SD higher litigation rate changed biennial physician growth by less than +/-1% (TOST p=0.023; point estimate -0.21% with 90% CI -0.84% to +0.42%). For hospital facility-count growth the point estimate was +0.07% (90% CI -0.91% to +1.06%): it was within the +/-2% margin (p=0.002) but not the stricter +/-1% margin (p=0.059). Thus the data are consistent with the absence of a policy-relevant effect on physician growth, and with at most a small effect on hospital facility-count growth. Detailed TOST results by margin are reported in Table 4.</w:t>
       </w:r>
     </w:p>
     <w:p>
@@ -502,7 +502,7 @@
           <w:i w:val="0"/>
           <w:sz w:val="24"/>
         </w:rPr>
-        <w:t>Using raw litigation counts rather than rates did not reveal a negative association in this measured-only design (p=0.51). Figure 2 shows the contrast: the count exposure is confounded by specialty size (panel a), whereas the rate-adjusted exposure is not (panel b); points are coloured and shaped by specialty so readers can identify which fields drive any apparent pattern. The annual hospital and interpolated annual-physician sensitivity analyses were also null (p=0.99 and p=0.39), confirming that the null result holds across panel frequency and exposure definition. The JOCS-CP indicator was positive in sign in the obstetric-hospital model (coefficient +0.024, raw p=0.013), but it did not remain significant after the small-cluster correction and Holm adjustment for the exploratory sensitivity family (Holm p=0.250); we treat it as exploratory and do not interpret it as a causal policy effect.</w:t>
+        <w:t>Using raw litigation counts rather than rates did not reveal a negative association in this measured-only design (p=0.51). Figure 5 shows the contrast: the count exposure is confounded by specialty size (panel a), whereas the rate-adjusted exposure is not (panel b); points are coloured and shaped by specialty so readers can identify which fields drive any apparent pattern. The annual hospital and interpolated annual-physician sensitivity analyses were also null (p=0.99 and p=0.39), confirming that the null result holds across panel frequency and exposure definition. The JOCS-CP indicator was positive in sign in the obstetric-hospital model (coefficient +0.024, raw p=0.013), but it did not remain significant after the small-cluster correction and Holm adjustment for the exploratory sensitivity family (Holm p=0.250); we treat it as exploratory and do not interpret it as a causal policy effect.</w:t>
       </w:r>
     </w:p>
     <w:p>
@@ -516,7 +516,7 @@
           <w:i w:val="0"/>
           <w:sz w:val="24"/>
         </w:rPr>
-        <w:t>The same count-versus-rate contrast for biennial hospital facility-count growth is shown in Figure 3. As with physician growth, the count exposure creates a spurious size confound that disappears once the rate-adjusted exposure is used.</w:t>
+        <w:t>The same count-versus-rate contrast for biennial hospital facility-count growth is shown in Figure 6. As with physician growth, the count exposure creates a spurious size confound that disappears once the rate-adjusted exposure is used.</w:t>
       </w:r>
     </w:p>
     <w:p>
@@ -544,7 +544,7 @@
           <w:i w:val="0"/>
           <w:sz w:val="24"/>
         </w:rPr>
-        <w:t>A reverse specification (change in litigation rate regressed on lagged log physicians) was also null (coefficient +0.097, p=0.85; Table 2), making a reverse-causation interpretation of the null unlikely.</w:t>
+        <w:t>A reverse specification (change in litigation rate regressed on lagged log physicians) was also null (coefficient +0.097, p=0.85; Table 3), making a reverse-causation interpretation of the null unlikely.</w:t>
       </w:r>
     </w:p>
     <w:p>
@@ -638,7 +638,7 @@
           <w:i w:val="0"/>
           <w:sz w:val="24"/>
         </w:rPr>
-        <w:t>The counterfactual projection made the practical implications of the null regression result explicit. Under the point estimate, eliminating all malpractice litigation would add only 1.1% to the projected 2034 national physician stock relative to baseline drift. Even under the 95% lower-bound (most favourable) coefficient it would add 5.2%, comparable to the 5.5% gain from a generic benchmark equal to the minimum detectable effect. General surgery, the only specialty with negative baseline drift, illustrates the break-even arithmetic: its projected 2024-2034 decline of -2.2% would be reduced to -0.1% under the point estimate and reversed to 7.7% under the 95% lower bound. The latter requires eliminating every remaining closed claim and assumes the most adverse (most negative) coefficient compatible with the data; a more realistic policy would achieve far less. Full projected 2034 physician counts by specialty and scenario are reported in Table 9; Figure 4 summarises the same information as marginal percentage changes. Litigation reduction is not a high-impact instrument for workforce allocation in this setting.</w:t>
+        <w:t>The counterfactual projection made the practical implications of the null regression result explicit. Under the point estimate, eliminating all malpractice litigation would add only 1.1% to the projected 2034 national physician stock relative to baseline drift. Even under the 95% lower-bound (most favourable) coefficient it would add 5.2%, comparable to the 5.5% gain from a generic benchmark equal to the minimum detectable effect. General surgery, the only specialty with negative baseline drift, illustrates the break-even arithmetic: its projected 2024-2034 decline of -2.2% would be reduced to -0.1% under the point estimate and reversed to 7.7% under the 95% lower bound. The latter requires eliminating every remaining closed claim and assumes the most adverse (most negative) coefficient compatible with the data; a more realistic policy would achieve far less. Full projected 2034 physician counts by specialty and scenario are reported in Table 9; Figure 7 summarises the same information as marginal percentage changes. Litigation reduction is not a high-impact instrument for workforce allocation in this setting.</w:t>
       </w:r>
     </w:p>
     <w:p>
@@ -866,7 +866,7 @@
           <w:i w:val="0"/>
           <w:sz w:val="24"/>
         </w:rPr>
-        <w:t>The raw-count sensitivity did not reveal a negative association in these data, illustrating that the apparent count-litigation relationship does not translate into a behavioural effect once specialty size is accounted for (Figure 2). This is a cautionary example for workforce research that pairs administrative count series, and shows why rate-based, measured-only designs are preferable when testing litigation-workforce hypotheses.</w:t>
+        <w:t>The raw-count sensitivity did not reveal a negative association in these data, illustrating that the apparent count-litigation relationship does not translate into a behavioural effect once specialty size is accounted for (Figure 5). This is a cautionary example for workforce research that pairs administrative count series, and shows why rate-based, measured-only designs are preferable when testing litigation-workforce hypotheses.</w:t>
       </w:r>
     </w:p>
     <w:p>
@@ -2475,7 +2475,729 @@
           <w:b/>
           <w:sz w:val="20"/>
         </w:rPr>
-        <w:t>Table 1. Physicians, litigation rate (per 1,000 physicians) and hospital facilities by specialty, first and last waves.</w:t>
+        <w:t>Figure 1. Sensitivity-analysis framework for evaluating malpractice-litigation risk as a healthcare workforce-allocation instrument.</w:t>
+      </w:r>
+    </w:p>
+    <w:p/>
+    <w:p>
+      <w:pPr>
+        <w:spacing w:before="280" w:after="120"/>
+      </w:pPr>
+      <w:r>
+        <w:rPr>
+          <w:rFonts w:ascii="Times New Roman" w:hAnsi="Times New Roman"/>
+          <w:b/>
+          <w:sz w:val="20"/>
+        </w:rPr>
+        <w:t>Figure 2. Closed malpractice claims per 1,000 physicians by specialty, 2008-2024 (rates, not counts).</w:t>
+      </w:r>
+    </w:p>
+    <w:p/>
+    <w:p>
+      <w:pPr>
+        <w:spacing w:before="280" w:after="120"/>
+      </w:pPr>
+      <w:r>
+        <w:rPr>
+          <w:rFonts w:ascii="Times New Roman" w:hAnsi="Times New Roman"/>
+          <w:b/>
+          <w:sz w:val="20"/>
+        </w:rPr>
+        <w:t>Figure 3. Physician workforce by specialty, indexed to 2008 (=100).</w:t>
+      </w:r>
+    </w:p>
+    <w:p/>
+    <w:p>
+      <w:pPr>
+        <w:spacing w:before="280" w:after="120"/>
+      </w:pPr>
+      <w:r>
+        <w:rPr>
+          <w:rFonts w:ascii="Times New Roman" w:hAnsi="Times New Roman"/>
+          <w:b/>
+          <w:sz w:val="20"/>
+        </w:rPr>
+        <w:t>Figure 4. Equivalence (TOST) of the litigation-rate effect against +/-1% and +/-2% margins; horizontal bars are 90% confidence intervals.</w:t>
+      </w:r>
+    </w:p>
+    <w:p/>
+    <w:p>
+      <w:pPr>
+        <w:spacing w:before="280" w:after="120"/>
+      </w:pPr>
+      <w:r>
+        <w:rPr>
+          <w:rFonts w:ascii="Times New Roman" w:hAnsi="Times New Roman"/>
+          <w:b/>
+          <w:sz w:val="20"/>
+        </w:rPr>
+        <w:t>Figure 5. Biennial physician growth against lagged litigation exposure measured as (a) counts and (b) rates. Points are coloured by specialty; the count panel shows the size confounding that the rate panel removes.</w:t>
+      </w:r>
+    </w:p>
+    <w:p/>
+    <w:p>
+      <w:pPr>
+        <w:spacing w:before="280" w:after="120"/>
+      </w:pPr>
+      <w:r>
+        <w:rPr>
+          <w:rFonts w:ascii="Times New Roman" w:hAnsi="Times New Roman"/>
+          <w:b/>
+          <w:sz w:val="20"/>
+        </w:rPr>
+        <w:t>Figure 6. Biennial hospital facility-count growth against lagged litigation exposure measured as (a) counts and (b) rates. Points are coloured by specialty; the rate-adjusted panel shows no systematic association.</w:t>
+      </w:r>
+    </w:p>
+    <w:p/>
+    <w:p>
+      <w:pPr>
+        <w:spacing w:before="280" w:after="120"/>
+      </w:pPr>
+      <w:r>
+        <w:rPr>
+          <w:rFonts w:ascii="Times New Roman" w:hAnsi="Times New Roman"/>
+          <w:b/>
+          <w:sz w:val="20"/>
+        </w:rPr>
+        <w:t>Figure 7. Counterfactual policy simulation: marginal 10-year change in physician counts by specialty relative to the projected baseline drift. The MDE benchmark is the minimum detectable per-SD effect from the primary analysis.</w:t>
+      </w:r>
+    </w:p>
+    <w:p/>
+    <w:p>
+      <w:pPr>
+        <w:spacing w:before="280" w:after="120"/>
+      </w:pPr>
+      <w:r>
+        <w:rPr>
+          <w:rFonts w:ascii="Times New Roman" w:hAnsi="Times New Roman"/>
+          <w:b/>
+          <w:sz w:val="20"/>
+        </w:rPr>
+        <w:t>Table 1. Primary data sources and their resolution.</w:t>
+      </w:r>
+    </w:p>
+    <w:tbl>
+      <w:tblPr>
+        <w:tblStyle w:val="TableGrid"/>
+        <w:tblW w:type="auto" w:w="0"/>
+        <w:tblLook w:firstColumn="1" w:firstRow="1" w:lastColumn="0" w:lastRow="0" w:noHBand="0" w:noVBand="1" w:val="04A0"/>
+      </w:tblPr>
+      <w:tblGrid>
+        <w:gridCol w:w="1872"/>
+        <w:gridCol w:w="1872"/>
+        <w:gridCol w:w="1872"/>
+        <w:gridCol w:w="1872"/>
+        <w:gridCol w:w="1872"/>
+      </w:tblGrid>
+      <w:tr>
+        <w:tc>
+          <w:tcPr>
+            <w:tcW w:type="dxa" w:w="1872"/>
+          </w:tcPr>
+          <w:p>
+            <w:pPr>
+              <w:jc w:val="center"/>
+            </w:pPr>
+            <w:r>
+              <w:rPr>
+                <w:rFonts w:ascii="Times New Roman" w:hAnsi="Times New Roman"/>
+                <w:b/>
+                <w:sz w:val="18"/>
+              </w:rPr>
+              <w:t>Series</w:t>
+            </w:r>
+          </w:p>
+        </w:tc>
+        <w:tc>
+          <w:tcPr>
+            <w:tcW w:type="dxa" w:w="1872"/>
+          </w:tcPr>
+          <w:p>
+            <w:pPr>
+              <w:jc w:val="center"/>
+            </w:pPr>
+            <w:r>
+              <w:rPr>
+                <w:rFonts w:ascii="Times New Roman" w:hAnsi="Times New Roman"/>
+                <w:b/>
+                <w:sz w:val="18"/>
+              </w:rPr>
+              <w:t>Source</w:t>
+            </w:r>
+          </w:p>
+        </w:tc>
+        <w:tc>
+          <w:tcPr>
+            <w:tcW w:type="dxa" w:w="1872"/>
+          </w:tcPr>
+          <w:p>
+            <w:pPr>
+              <w:jc w:val="center"/>
+            </w:pPr>
+            <w:r>
+              <w:rPr>
+                <w:rFonts w:ascii="Times New Roman" w:hAnsi="Times New Roman"/>
+                <w:b/>
+                <w:sz w:val="18"/>
+              </w:rPr>
+              <w:t>Resolution</w:t>
+            </w:r>
+          </w:p>
+        </w:tc>
+        <w:tc>
+          <w:tcPr>
+            <w:tcW w:type="dxa" w:w="1872"/>
+          </w:tcPr>
+          <w:p>
+            <w:pPr>
+              <w:jc w:val="center"/>
+            </w:pPr>
+            <w:r>
+              <w:rPr>
+                <w:rFonts w:ascii="Times New Roman" w:hAnsi="Times New Roman"/>
+                <w:b/>
+                <w:sz w:val="18"/>
+              </w:rPr>
+              <w:t>Years</w:t>
+            </w:r>
+          </w:p>
+        </w:tc>
+        <w:tc>
+          <w:tcPr>
+            <w:tcW w:type="dxa" w:w="1872"/>
+          </w:tcPr>
+          <w:p>
+            <w:pPr>
+              <w:jc w:val="center"/>
+            </w:pPr>
+            <w:r>
+              <w:rPr>
+                <w:rFonts w:ascii="Times New Roman" w:hAnsi="Times New Roman"/>
+                <w:b/>
+                <w:sz w:val="18"/>
+              </w:rPr>
+              <w:t>Role</w:t>
+            </w:r>
+          </w:p>
+        </w:tc>
+      </w:tr>
+      <w:tr>
+        <w:tc>
+          <w:tcPr>
+            <w:tcW w:type="dxa" w:w="1872"/>
+          </w:tcPr>
+          <w:p>
+            <w:r>
+              <w:rPr>
+                <w:rFonts w:ascii="Times New Roman" w:hAnsi="Times New Roman"/>
+                <w:sz w:val="18"/>
+              </w:rPr>
+              <w:t>Physicians by specialty</w:t>
+            </w:r>
+          </w:p>
+        </w:tc>
+        <w:tc>
+          <w:tcPr>
+            <w:tcW w:type="dxa" w:w="1872"/>
+          </w:tcPr>
+          <w:p>
+            <w:pPr>
+              <w:jc w:val="center"/>
+            </w:pPr>
+            <w:r>
+              <w:rPr>
+                <w:rFonts w:ascii="Times New Roman" w:hAnsi="Times New Roman"/>
+                <w:sz w:val="18"/>
+              </w:rPr>
+              <w:t>MHLW Statistics of Physicians</w:t>
+            </w:r>
+          </w:p>
+        </w:tc>
+        <w:tc>
+          <w:tcPr>
+            <w:tcW w:type="dxa" w:w="1872"/>
+          </w:tcPr>
+          <w:p>
+            <w:pPr>
+              <w:jc w:val="center"/>
+            </w:pPr>
+            <w:r>
+              <w:rPr>
+                <w:rFonts w:ascii="Times New Roman" w:hAnsi="Times New Roman"/>
+                <w:sz w:val="18"/>
+              </w:rPr>
+              <w:t>Biennial</w:t>
+            </w:r>
+          </w:p>
+        </w:tc>
+        <w:tc>
+          <w:tcPr>
+            <w:tcW w:type="dxa" w:w="1872"/>
+          </w:tcPr>
+          <w:p>
+            <w:pPr>
+              <w:jc w:val="center"/>
+            </w:pPr>
+            <w:r>
+              <w:rPr>
+                <w:rFonts w:ascii="Times New Roman" w:hAnsi="Times New Roman"/>
+                <w:sz w:val="18"/>
+              </w:rPr>
+              <w:t>2004-2024</w:t>
+            </w:r>
+          </w:p>
+        </w:tc>
+        <w:tc>
+          <w:tcPr>
+            <w:tcW w:type="dxa" w:w="1872"/>
+          </w:tcPr>
+          <w:p>
+            <w:pPr>
+              <w:jc w:val="center"/>
+            </w:pPr>
+            <w:r>
+              <w:rPr>
+                <w:rFonts w:ascii="Times New Roman" w:hAnsi="Times New Roman"/>
+                <w:sz w:val="18"/>
+              </w:rPr>
+              <w:t>Denominator &amp; outcome</w:t>
+            </w:r>
+          </w:p>
+        </w:tc>
+      </w:tr>
+      <w:tr>
+        <w:tc>
+          <w:tcPr>
+            <w:tcW w:type="dxa" w:w="1872"/>
+          </w:tcPr>
+          <w:p>
+            <w:r>
+              <w:rPr>
+                <w:rFonts w:ascii="Times New Roman" w:hAnsi="Times New Roman"/>
+                <w:sz w:val="18"/>
+              </w:rPr>
+              <w:t>Closed malpractice claims</w:t>
+            </w:r>
+          </w:p>
+        </w:tc>
+        <w:tc>
+          <w:tcPr>
+            <w:tcW w:type="dxa" w:w="1872"/>
+          </w:tcPr>
+          <w:p>
+            <w:pPr>
+              <w:jc w:val="center"/>
+            </w:pPr>
+            <w:r>
+              <w:rPr>
+                <w:rFonts w:ascii="Times New Roman" w:hAnsi="Times New Roman"/>
+                <w:sz w:val="18"/>
+              </w:rPr>
+              <w:t>Supreme Court, by specialty</w:t>
+            </w:r>
+          </w:p>
+        </w:tc>
+        <w:tc>
+          <w:tcPr>
+            <w:tcW w:type="dxa" w:w="1872"/>
+          </w:tcPr>
+          <w:p>
+            <w:pPr>
+              <w:jc w:val="center"/>
+            </w:pPr>
+            <w:r>
+              <w:rPr>
+                <w:rFonts w:ascii="Times New Roman" w:hAnsi="Times New Roman"/>
+                <w:sz w:val="18"/>
+              </w:rPr>
+              <w:t>Annual</w:t>
+            </w:r>
+          </w:p>
+        </w:tc>
+        <w:tc>
+          <w:tcPr>
+            <w:tcW w:type="dxa" w:w="1872"/>
+          </w:tcPr>
+          <w:p>
+            <w:pPr>
+              <w:jc w:val="center"/>
+            </w:pPr>
+            <w:r>
+              <w:rPr>
+                <w:rFonts w:ascii="Times New Roman" w:hAnsi="Times New Roman"/>
+                <w:sz w:val="18"/>
+              </w:rPr>
+              <w:t>2008-2024</w:t>
+            </w:r>
+          </w:p>
+        </w:tc>
+        <w:tc>
+          <w:tcPr>
+            <w:tcW w:type="dxa" w:w="1872"/>
+          </w:tcPr>
+          <w:p>
+            <w:pPr>
+              <w:jc w:val="center"/>
+            </w:pPr>
+            <w:r>
+              <w:rPr>
+                <w:rFonts w:ascii="Times New Roman" w:hAnsi="Times New Roman"/>
+                <w:sz w:val="18"/>
+              </w:rPr>
+              <w:t>Exposure (numerator)</w:t>
+            </w:r>
+          </w:p>
+        </w:tc>
+      </w:tr>
+      <w:tr>
+        <w:tc>
+          <w:tcPr>
+            <w:tcW w:type="dxa" w:w="1872"/>
+          </w:tcPr>
+          <w:p>
+            <w:r>
+              <w:rPr>
+                <w:rFonts w:ascii="Times New Roman" w:hAnsi="Times New Roman"/>
+                <w:sz w:val="18"/>
+              </w:rPr>
+              <w:t>Hospitals by specialty</w:t>
+            </w:r>
+          </w:p>
+        </w:tc>
+        <w:tc>
+          <w:tcPr>
+            <w:tcW w:type="dxa" w:w="1872"/>
+          </w:tcPr>
+          <w:p>
+            <w:pPr>
+              <w:jc w:val="center"/>
+            </w:pPr>
+            <w:r>
+              <w:rPr>
+                <w:rFonts w:ascii="Times New Roman" w:hAnsi="Times New Roman"/>
+                <w:sz w:val="18"/>
+              </w:rPr>
+              <w:t>MHLW Survey of Medical Institutions</w:t>
+            </w:r>
+          </w:p>
+        </w:tc>
+        <w:tc>
+          <w:tcPr>
+            <w:tcW w:type="dxa" w:w="1872"/>
+          </w:tcPr>
+          <w:p>
+            <w:pPr>
+              <w:jc w:val="center"/>
+            </w:pPr>
+            <w:r>
+              <w:rPr>
+                <w:rFonts w:ascii="Times New Roman" w:hAnsi="Times New Roman"/>
+                <w:sz w:val="18"/>
+              </w:rPr>
+              <w:t>Annual</w:t>
+            </w:r>
+          </w:p>
+        </w:tc>
+        <w:tc>
+          <w:tcPr>
+            <w:tcW w:type="dxa" w:w="1872"/>
+          </w:tcPr>
+          <w:p>
+            <w:pPr>
+              <w:jc w:val="center"/>
+            </w:pPr>
+            <w:r>
+              <w:rPr>
+                <w:rFonts w:ascii="Times New Roman" w:hAnsi="Times New Roman"/>
+                <w:sz w:val="18"/>
+              </w:rPr>
+              <w:t>2008-2024</w:t>
+            </w:r>
+          </w:p>
+        </w:tc>
+        <w:tc>
+          <w:tcPr>
+            <w:tcW w:type="dxa" w:w="1872"/>
+          </w:tcPr>
+          <w:p>
+            <w:pPr>
+              <w:jc w:val="center"/>
+            </w:pPr>
+            <w:r>
+              <w:rPr>
+                <w:rFonts w:ascii="Times New Roman" w:hAnsi="Times New Roman"/>
+                <w:sz w:val="18"/>
+              </w:rPr>
+              <w:t>Outcome</w:t>
+            </w:r>
+          </w:p>
+        </w:tc>
+      </w:tr>
+      <w:tr>
+        <w:tc>
+          <w:tcPr>
+            <w:tcW w:type="dxa" w:w="1872"/>
+          </w:tcPr>
+          <w:p>
+            <w:r>
+              <w:rPr>
+                <w:rFonts w:ascii="Times New Roman" w:hAnsi="Times New Roman"/>
+                <w:sz w:val="18"/>
+              </w:rPr>
+              <w:t>Clinics by specialty</w:t>
+            </w:r>
+          </w:p>
+        </w:tc>
+        <w:tc>
+          <w:tcPr>
+            <w:tcW w:type="dxa" w:w="1872"/>
+          </w:tcPr>
+          <w:p>
+            <w:pPr>
+              <w:jc w:val="center"/>
+            </w:pPr>
+            <w:r>
+              <w:rPr>
+                <w:rFonts w:ascii="Times New Roman" w:hAnsi="Times New Roman"/>
+                <w:sz w:val="18"/>
+              </w:rPr>
+              <w:t>MHLW Survey (static)</w:t>
+            </w:r>
+          </w:p>
+        </w:tc>
+        <w:tc>
+          <w:tcPr>
+            <w:tcW w:type="dxa" w:w="1872"/>
+          </w:tcPr>
+          <w:p>
+            <w:pPr>
+              <w:jc w:val="center"/>
+            </w:pPr>
+            <w:r>
+              <w:rPr>
+                <w:rFonts w:ascii="Times New Roman" w:hAnsi="Times New Roman"/>
+                <w:sz w:val="18"/>
+              </w:rPr>
+              <w:t>Every 3 years</w:t>
+            </w:r>
+          </w:p>
+        </w:tc>
+        <w:tc>
+          <w:tcPr>
+            <w:tcW w:type="dxa" w:w="1872"/>
+          </w:tcPr>
+          <w:p>
+            <w:pPr>
+              <w:jc w:val="center"/>
+            </w:pPr>
+            <w:r>
+              <w:rPr>
+                <w:rFonts w:ascii="Times New Roman" w:hAnsi="Times New Roman"/>
+                <w:sz w:val="18"/>
+              </w:rPr>
+              <w:t>2008-2023</w:t>
+            </w:r>
+          </w:p>
+        </w:tc>
+        <w:tc>
+          <w:tcPr>
+            <w:tcW w:type="dxa" w:w="1872"/>
+          </w:tcPr>
+          <w:p>
+            <w:pPr>
+              <w:jc w:val="center"/>
+            </w:pPr>
+            <w:r>
+              <w:rPr>
+                <w:rFonts w:ascii="Times New Roman" w:hAnsi="Times New Roman"/>
+                <w:sz w:val="18"/>
+              </w:rPr>
+              <w:t>Descriptive only</w:t>
+            </w:r>
+          </w:p>
+        </w:tc>
+      </w:tr>
+      <w:tr>
+        <w:tc>
+          <w:tcPr>
+            <w:tcW w:type="dxa" w:w="1872"/>
+          </w:tcPr>
+          <w:p>
+            <w:r>
+              <w:rPr>
+                <w:rFonts w:ascii="Times New Roman" w:hAnsi="Times New Roman"/>
+                <w:sz w:val="18"/>
+              </w:rPr>
+              <w:t>JMSR report counts</w:t>
+            </w:r>
+          </w:p>
+        </w:tc>
+        <w:tc>
+          <w:tcPr>
+            <w:tcW w:type="dxa" w:w="1872"/>
+          </w:tcPr>
+          <w:p>
+            <w:pPr>
+              <w:jc w:val="center"/>
+            </w:pPr>
+            <w:r>
+              <w:rPr>
+                <w:rFonts w:ascii="Times New Roman" w:hAnsi="Times New Roman"/>
+                <w:sz w:val="18"/>
+              </w:rPr>
+              <w:t>JMSR / MAIS</w:t>
+            </w:r>
+          </w:p>
+        </w:tc>
+        <w:tc>
+          <w:tcPr>
+            <w:tcW w:type="dxa" w:w="1872"/>
+          </w:tcPr>
+          <w:p>
+            <w:pPr>
+              <w:jc w:val="center"/>
+            </w:pPr>
+            <w:r>
+              <w:rPr>
+                <w:rFonts w:ascii="Times New Roman" w:hAnsi="Times New Roman"/>
+                <w:sz w:val="18"/>
+              </w:rPr>
+              <w:t>Annual</w:t>
+            </w:r>
+          </w:p>
+        </w:tc>
+        <w:tc>
+          <w:tcPr>
+            <w:tcW w:type="dxa" w:w="1872"/>
+          </w:tcPr>
+          <w:p>
+            <w:pPr>
+              <w:jc w:val="center"/>
+            </w:pPr>
+            <w:r>
+              <w:rPr>
+                <w:rFonts w:ascii="Times New Roman" w:hAnsi="Times New Roman"/>
+                <w:sz w:val="18"/>
+              </w:rPr>
+              <w:t>2015-2024</w:t>
+            </w:r>
+          </w:p>
+        </w:tc>
+        <w:tc>
+          <w:tcPr>
+            <w:tcW w:type="dxa" w:w="1872"/>
+          </w:tcPr>
+          <w:p>
+            <w:pPr>
+              <w:jc w:val="center"/>
+            </w:pPr>
+            <w:r>
+              <w:rPr>
+                <w:rFonts w:ascii="Times New Roman" w:hAnsi="Times New Roman"/>
+                <w:sz w:val="18"/>
+              </w:rPr>
+              <w:t>Sensitivity (2016-2024)</w:t>
+            </w:r>
+          </w:p>
+        </w:tc>
+      </w:tr>
+      <w:tr>
+        <w:tc>
+          <w:tcPr>
+            <w:tcW w:type="dxa" w:w="1872"/>
+          </w:tcPr>
+          <w:p>
+            <w:r>
+              <w:rPr>
+                <w:rFonts w:ascii="Times New Roman" w:hAnsi="Times New Roman"/>
+                <w:sz w:val="18"/>
+              </w:rPr>
+              <w:t>Newspaper article counts</w:t>
+            </w:r>
+          </w:p>
+        </w:tc>
+        <w:tc>
+          <w:tcPr>
+            <w:tcW w:type="dxa" w:w="1872"/>
+          </w:tcPr>
+          <w:p>
+            <w:pPr>
+              <w:jc w:val="center"/>
+            </w:pPr>
+            <w:r>
+              <w:rPr>
+                <w:rFonts w:ascii="Times New Roman" w:hAnsi="Times New Roman"/>
+                <w:sz w:val="18"/>
+              </w:rPr>
+              <w:t>Nikkei Telecom 21</w:t>
+            </w:r>
+          </w:p>
+        </w:tc>
+        <w:tc>
+          <w:tcPr>
+            <w:tcW w:type="dxa" w:w="1872"/>
+          </w:tcPr>
+          <w:p>
+            <w:pPr>
+              <w:jc w:val="center"/>
+            </w:pPr>
+            <w:r>
+              <w:rPr>
+                <w:rFonts w:ascii="Times New Roman" w:hAnsi="Times New Roman"/>
+                <w:sz w:val="18"/>
+              </w:rPr>
+              <w:t>Annual</w:t>
+            </w:r>
+          </w:p>
+        </w:tc>
+        <w:tc>
+          <w:tcPr>
+            <w:tcW w:type="dxa" w:w="1872"/>
+          </w:tcPr>
+          <w:p>
+            <w:pPr>
+              <w:jc w:val="center"/>
+            </w:pPr>
+            <w:r>
+              <w:rPr>
+                <w:rFonts w:ascii="Times New Roman" w:hAnsi="Times New Roman"/>
+                <w:sz w:val="18"/>
+              </w:rPr>
+              <w:t>2008-2018</w:t>
+            </w:r>
+          </w:p>
+        </w:tc>
+        <w:tc>
+          <w:tcPr>
+            <w:tcW w:type="dxa" w:w="1872"/>
+          </w:tcPr>
+          <w:p>
+            <w:pPr>
+              <w:jc w:val="center"/>
+            </w:pPr>
+            <w:r>
+              <w:rPr>
+                <w:rFonts w:ascii="Times New Roman" w:hAnsi="Times New Roman"/>
+                <w:sz w:val="18"/>
+              </w:rPr>
+              <w:t>Sensitivity (2009-2018)</w:t>
+            </w:r>
+          </w:p>
+        </w:tc>
+      </w:tr>
+    </w:tbl>
+    <w:p/>
+    <w:p>
+      <w:pPr>
+        <w:spacing w:before="280" w:after="120"/>
+      </w:pPr>
+      <w:r>
+        <w:rPr>
+          <w:rFonts w:ascii="Times New Roman" w:hAnsi="Times New Roman"/>
+          <w:b/>
+          <w:sz w:val="20"/>
+        </w:rPr>
+        <w:t>Table 2. Physicians, litigation rate (per 1,000 physicians) and hospital facilities by specialty, first and last waves.</w:t>
       </w:r>
     </w:p>
     <w:tbl>
@@ -4049,21 +4771,7 @@
           <w:b/>
           <w:sz w:val="20"/>
         </w:rPr>
-        <w:t>Figure 1. Equivalence (TOST) of the litigation-rate effect against +/-1% and +/-2% margins; horizontal bars are 90% confidence intervals.</w:t>
-      </w:r>
-    </w:p>
-    <w:p/>
-    <w:p>
-      <w:pPr>
-        <w:spacing w:before="280" w:after="120"/>
-      </w:pPr>
-      <w:r>
-        <w:rPr>
-          <w:rFonts w:ascii="Times New Roman" w:hAnsi="Times New Roman"/>
-          <w:b/>
-          <w:sz w:val="20"/>
-        </w:rPr>
-        <w:t>Table 2. Panel fixed-effects models and sensitivity analyses.</w:t>
+        <w:t>Table 3. Panel fixed-effects models and sensitivity analyses.</w:t>
       </w:r>
     </w:p>
     <w:tbl>
@@ -4671,714 +5379,6 @@
                 <w:sz w:val="18"/>
               </w:rPr>
               <w:t>96</w:t>
-            </w:r>
-          </w:p>
-        </w:tc>
-      </w:tr>
-    </w:tbl>
-    <w:p/>
-    <w:p>
-      <w:pPr>
-        <w:spacing w:before="280" w:after="120"/>
-      </w:pPr>
-      <w:r>
-        <w:rPr>
-          <w:rFonts w:ascii="Times New Roman" w:hAnsi="Times New Roman"/>
-          <w:b/>
-          <w:sz w:val="20"/>
-        </w:rPr>
-        <w:t>Figure 2. Biennial physician growth against lagged litigation exposure measured as (a) counts and (b) rates. Points are coloured by specialty; the count panel shows the size confounding that the rate panel removes.</w:t>
-      </w:r>
-    </w:p>
-    <w:p/>
-    <w:p>
-      <w:pPr>
-        <w:spacing w:before="280" w:after="120"/>
-      </w:pPr>
-      <w:r>
-        <w:rPr>
-          <w:rFonts w:ascii="Times New Roman" w:hAnsi="Times New Roman"/>
-          <w:b/>
-          <w:sz w:val="20"/>
-        </w:rPr>
-        <w:t>Figure 3. Biennial hospital facility-count growth against lagged litigation exposure measured as (a) counts and (b) rates. Points are coloured by specialty; the rate-adjusted panel shows no systematic association.</w:t>
-      </w:r>
-    </w:p>
-    <w:p/>
-    <w:p>
-      <w:pPr>
-        <w:spacing w:before="280" w:after="120"/>
-      </w:pPr>
-      <w:r>
-        <w:rPr>
-          <w:rFonts w:ascii="Times New Roman" w:hAnsi="Times New Roman"/>
-          <w:b/>
-          <w:sz w:val="20"/>
-        </w:rPr>
-        <w:t>Figure 4. Counterfactual policy simulation: marginal 10-year change in physician counts by specialty relative to the projected baseline drift. The MDE benchmark is the minimum detectable per-SD effect from the primary analysis.</w:t>
-      </w:r>
-    </w:p>
-    <w:p/>
-    <w:p>
-      <w:pPr>
-        <w:spacing w:before="280" w:after="120"/>
-      </w:pPr>
-      <w:r>
-        <w:rPr>
-          <w:rFonts w:ascii="Times New Roman" w:hAnsi="Times New Roman"/>
-          <w:b/>
-          <w:sz w:val="20"/>
-        </w:rPr>
-        <w:t>Figure 5. Sensitivity-analysis framework for evaluating malpractice-litigation risk as a healthcare workforce-allocation instrument.</w:t>
-      </w:r>
-    </w:p>
-    <w:p/>
-    <w:p>
-      <w:pPr>
-        <w:spacing w:before="280" w:after="120"/>
-      </w:pPr>
-      <w:r>
-        <w:rPr>
-          <w:rFonts w:ascii="Times New Roman" w:hAnsi="Times New Roman"/>
-          <w:b/>
-          <w:sz w:val="20"/>
-        </w:rPr>
-        <w:t>Figure 6. Closed malpractice claims per 1,000 physicians by specialty, 2008-2024 (rates, not counts).</w:t>
-      </w:r>
-    </w:p>
-    <w:p/>
-    <w:p>
-      <w:pPr>
-        <w:spacing w:before="280" w:after="120"/>
-      </w:pPr>
-      <w:r>
-        <w:rPr>
-          <w:rFonts w:ascii="Times New Roman" w:hAnsi="Times New Roman"/>
-          <w:b/>
-          <w:sz w:val="20"/>
-        </w:rPr>
-        <w:t>Figure 7. Physician workforce by specialty, indexed to 2008 (=100).</w:t>
-      </w:r>
-    </w:p>
-    <w:p/>
-    <w:p>
-      <w:pPr>
-        <w:spacing w:before="280" w:after="120"/>
-      </w:pPr>
-      <w:r>
-        <w:rPr>
-          <w:rFonts w:ascii="Times New Roman" w:hAnsi="Times New Roman"/>
-          <w:b/>
-          <w:sz w:val="20"/>
-        </w:rPr>
-        <w:t>Table 3. Primary data sources and their resolution.</w:t>
-      </w:r>
-    </w:p>
-    <w:tbl>
-      <w:tblPr>
-        <w:tblStyle w:val="TableGrid"/>
-        <w:tblW w:type="auto" w:w="0"/>
-        <w:tblLook w:firstColumn="1" w:firstRow="1" w:lastColumn="0" w:lastRow="0" w:noHBand="0" w:noVBand="1" w:val="04A0"/>
-      </w:tblPr>
-      <w:tblGrid>
-        <w:gridCol w:w="1872"/>
-        <w:gridCol w:w="1872"/>
-        <w:gridCol w:w="1872"/>
-        <w:gridCol w:w="1872"/>
-        <w:gridCol w:w="1872"/>
-      </w:tblGrid>
-      <w:tr>
-        <w:tc>
-          <w:tcPr>
-            <w:tcW w:type="dxa" w:w="1872"/>
-          </w:tcPr>
-          <w:p>
-            <w:pPr>
-              <w:jc w:val="center"/>
-            </w:pPr>
-            <w:r>
-              <w:rPr>
-                <w:rFonts w:ascii="Times New Roman" w:hAnsi="Times New Roman"/>
-                <w:b/>
-                <w:sz w:val="18"/>
-              </w:rPr>
-              <w:t>Series</w:t>
-            </w:r>
-          </w:p>
-        </w:tc>
-        <w:tc>
-          <w:tcPr>
-            <w:tcW w:type="dxa" w:w="1872"/>
-          </w:tcPr>
-          <w:p>
-            <w:pPr>
-              <w:jc w:val="center"/>
-            </w:pPr>
-            <w:r>
-              <w:rPr>
-                <w:rFonts w:ascii="Times New Roman" w:hAnsi="Times New Roman"/>
-                <w:b/>
-                <w:sz w:val="18"/>
-              </w:rPr>
-              <w:t>Source</w:t>
-            </w:r>
-          </w:p>
-        </w:tc>
-        <w:tc>
-          <w:tcPr>
-            <w:tcW w:type="dxa" w:w="1872"/>
-          </w:tcPr>
-          <w:p>
-            <w:pPr>
-              <w:jc w:val="center"/>
-            </w:pPr>
-            <w:r>
-              <w:rPr>
-                <w:rFonts w:ascii="Times New Roman" w:hAnsi="Times New Roman"/>
-                <w:b/>
-                <w:sz w:val="18"/>
-              </w:rPr>
-              <w:t>Resolution</w:t>
-            </w:r>
-          </w:p>
-        </w:tc>
-        <w:tc>
-          <w:tcPr>
-            <w:tcW w:type="dxa" w:w="1872"/>
-          </w:tcPr>
-          <w:p>
-            <w:pPr>
-              <w:jc w:val="center"/>
-            </w:pPr>
-            <w:r>
-              <w:rPr>
-                <w:rFonts w:ascii="Times New Roman" w:hAnsi="Times New Roman"/>
-                <w:b/>
-                <w:sz w:val="18"/>
-              </w:rPr>
-              <w:t>Years</w:t>
-            </w:r>
-          </w:p>
-        </w:tc>
-        <w:tc>
-          <w:tcPr>
-            <w:tcW w:type="dxa" w:w="1872"/>
-          </w:tcPr>
-          <w:p>
-            <w:pPr>
-              <w:jc w:val="center"/>
-            </w:pPr>
-            <w:r>
-              <w:rPr>
-                <w:rFonts w:ascii="Times New Roman" w:hAnsi="Times New Roman"/>
-                <w:b/>
-                <w:sz w:val="18"/>
-              </w:rPr>
-              <w:t>Role</w:t>
-            </w:r>
-          </w:p>
-        </w:tc>
-      </w:tr>
-      <w:tr>
-        <w:tc>
-          <w:tcPr>
-            <w:tcW w:type="dxa" w:w="1872"/>
-          </w:tcPr>
-          <w:p>
-            <w:r>
-              <w:rPr>
-                <w:rFonts w:ascii="Times New Roman" w:hAnsi="Times New Roman"/>
-                <w:sz w:val="18"/>
-              </w:rPr>
-              <w:t>Physicians by specialty</w:t>
-            </w:r>
-          </w:p>
-        </w:tc>
-        <w:tc>
-          <w:tcPr>
-            <w:tcW w:type="dxa" w:w="1872"/>
-          </w:tcPr>
-          <w:p>
-            <w:pPr>
-              <w:jc w:val="center"/>
-            </w:pPr>
-            <w:r>
-              <w:rPr>
-                <w:rFonts w:ascii="Times New Roman" w:hAnsi="Times New Roman"/>
-                <w:sz w:val="18"/>
-              </w:rPr>
-              <w:t>MHLW Statistics of Physicians</w:t>
-            </w:r>
-          </w:p>
-        </w:tc>
-        <w:tc>
-          <w:tcPr>
-            <w:tcW w:type="dxa" w:w="1872"/>
-          </w:tcPr>
-          <w:p>
-            <w:pPr>
-              <w:jc w:val="center"/>
-            </w:pPr>
-            <w:r>
-              <w:rPr>
-                <w:rFonts w:ascii="Times New Roman" w:hAnsi="Times New Roman"/>
-                <w:sz w:val="18"/>
-              </w:rPr>
-              <w:t>Biennial</w:t>
-            </w:r>
-          </w:p>
-        </w:tc>
-        <w:tc>
-          <w:tcPr>
-            <w:tcW w:type="dxa" w:w="1872"/>
-          </w:tcPr>
-          <w:p>
-            <w:pPr>
-              <w:jc w:val="center"/>
-            </w:pPr>
-            <w:r>
-              <w:rPr>
-                <w:rFonts w:ascii="Times New Roman" w:hAnsi="Times New Roman"/>
-                <w:sz w:val="18"/>
-              </w:rPr>
-              <w:t>2004-2024</w:t>
-            </w:r>
-          </w:p>
-        </w:tc>
-        <w:tc>
-          <w:tcPr>
-            <w:tcW w:type="dxa" w:w="1872"/>
-          </w:tcPr>
-          <w:p>
-            <w:pPr>
-              <w:jc w:val="center"/>
-            </w:pPr>
-            <w:r>
-              <w:rPr>
-                <w:rFonts w:ascii="Times New Roman" w:hAnsi="Times New Roman"/>
-                <w:sz w:val="18"/>
-              </w:rPr>
-              <w:t>Denominator &amp; outcome</w:t>
-            </w:r>
-          </w:p>
-        </w:tc>
-      </w:tr>
-      <w:tr>
-        <w:tc>
-          <w:tcPr>
-            <w:tcW w:type="dxa" w:w="1872"/>
-          </w:tcPr>
-          <w:p>
-            <w:r>
-              <w:rPr>
-                <w:rFonts w:ascii="Times New Roman" w:hAnsi="Times New Roman"/>
-                <w:sz w:val="18"/>
-              </w:rPr>
-              <w:t>Closed malpractice claims</w:t>
-            </w:r>
-          </w:p>
-        </w:tc>
-        <w:tc>
-          <w:tcPr>
-            <w:tcW w:type="dxa" w:w="1872"/>
-          </w:tcPr>
-          <w:p>
-            <w:pPr>
-              <w:jc w:val="center"/>
-            </w:pPr>
-            <w:r>
-              <w:rPr>
-                <w:rFonts w:ascii="Times New Roman" w:hAnsi="Times New Roman"/>
-                <w:sz w:val="18"/>
-              </w:rPr>
-              <w:t>Supreme Court, by specialty</w:t>
-            </w:r>
-          </w:p>
-        </w:tc>
-        <w:tc>
-          <w:tcPr>
-            <w:tcW w:type="dxa" w:w="1872"/>
-          </w:tcPr>
-          <w:p>
-            <w:pPr>
-              <w:jc w:val="center"/>
-            </w:pPr>
-            <w:r>
-              <w:rPr>
-                <w:rFonts w:ascii="Times New Roman" w:hAnsi="Times New Roman"/>
-                <w:sz w:val="18"/>
-              </w:rPr>
-              <w:t>Annual</w:t>
-            </w:r>
-          </w:p>
-        </w:tc>
-        <w:tc>
-          <w:tcPr>
-            <w:tcW w:type="dxa" w:w="1872"/>
-          </w:tcPr>
-          <w:p>
-            <w:pPr>
-              <w:jc w:val="center"/>
-            </w:pPr>
-            <w:r>
-              <w:rPr>
-                <w:rFonts w:ascii="Times New Roman" w:hAnsi="Times New Roman"/>
-                <w:sz w:val="18"/>
-              </w:rPr>
-              <w:t>2008-2024</w:t>
-            </w:r>
-          </w:p>
-        </w:tc>
-        <w:tc>
-          <w:tcPr>
-            <w:tcW w:type="dxa" w:w="1872"/>
-          </w:tcPr>
-          <w:p>
-            <w:pPr>
-              <w:jc w:val="center"/>
-            </w:pPr>
-            <w:r>
-              <w:rPr>
-                <w:rFonts w:ascii="Times New Roman" w:hAnsi="Times New Roman"/>
-                <w:sz w:val="18"/>
-              </w:rPr>
-              <w:t>Exposure (numerator)</w:t>
-            </w:r>
-          </w:p>
-        </w:tc>
-      </w:tr>
-      <w:tr>
-        <w:tc>
-          <w:tcPr>
-            <w:tcW w:type="dxa" w:w="1872"/>
-          </w:tcPr>
-          <w:p>
-            <w:r>
-              <w:rPr>
-                <w:rFonts w:ascii="Times New Roman" w:hAnsi="Times New Roman"/>
-                <w:sz w:val="18"/>
-              </w:rPr>
-              <w:t>Hospitals by specialty</w:t>
-            </w:r>
-          </w:p>
-        </w:tc>
-        <w:tc>
-          <w:tcPr>
-            <w:tcW w:type="dxa" w:w="1872"/>
-          </w:tcPr>
-          <w:p>
-            <w:pPr>
-              <w:jc w:val="center"/>
-            </w:pPr>
-            <w:r>
-              <w:rPr>
-                <w:rFonts w:ascii="Times New Roman" w:hAnsi="Times New Roman"/>
-                <w:sz w:val="18"/>
-              </w:rPr>
-              <w:t>MHLW Survey of Medical Institutions</w:t>
-            </w:r>
-          </w:p>
-        </w:tc>
-        <w:tc>
-          <w:tcPr>
-            <w:tcW w:type="dxa" w:w="1872"/>
-          </w:tcPr>
-          <w:p>
-            <w:pPr>
-              <w:jc w:val="center"/>
-            </w:pPr>
-            <w:r>
-              <w:rPr>
-                <w:rFonts w:ascii="Times New Roman" w:hAnsi="Times New Roman"/>
-                <w:sz w:val="18"/>
-              </w:rPr>
-              <w:t>Annual</w:t>
-            </w:r>
-          </w:p>
-        </w:tc>
-        <w:tc>
-          <w:tcPr>
-            <w:tcW w:type="dxa" w:w="1872"/>
-          </w:tcPr>
-          <w:p>
-            <w:pPr>
-              <w:jc w:val="center"/>
-            </w:pPr>
-            <w:r>
-              <w:rPr>
-                <w:rFonts w:ascii="Times New Roman" w:hAnsi="Times New Roman"/>
-                <w:sz w:val="18"/>
-              </w:rPr>
-              <w:t>2008-2024</w:t>
-            </w:r>
-          </w:p>
-        </w:tc>
-        <w:tc>
-          <w:tcPr>
-            <w:tcW w:type="dxa" w:w="1872"/>
-          </w:tcPr>
-          <w:p>
-            <w:pPr>
-              <w:jc w:val="center"/>
-            </w:pPr>
-            <w:r>
-              <w:rPr>
-                <w:rFonts w:ascii="Times New Roman" w:hAnsi="Times New Roman"/>
-                <w:sz w:val="18"/>
-              </w:rPr>
-              <w:t>Outcome</w:t>
-            </w:r>
-          </w:p>
-        </w:tc>
-      </w:tr>
-      <w:tr>
-        <w:tc>
-          <w:tcPr>
-            <w:tcW w:type="dxa" w:w="1872"/>
-          </w:tcPr>
-          <w:p>
-            <w:r>
-              <w:rPr>
-                <w:rFonts w:ascii="Times New Roman" w:hAnsi="Times New Roman"/>
-                <w:sz w:val="18"/>
-              </w:rPr>
-              <w:t>Clinics by specialty</w:t>
-            </w:r>
-          </w:p>
-        </w:tc>
-        <w:tc>
-          <w:tcPr>
-            <w:tcW w:type="dxa" w:w="1872"/>
-          </w:tcPr>
-          <w:p>
-            <w:pPr>
-              <w:jc w:val="center"/>
-            </w:pPr>
-            <w:r>
-              <w:rPr>
-                <w:rFonts w:ascii="Times New Roman" w:hAnsi="Times New Roman"/>
-                <w:sz w:val="18"/>
-              </w:rPr>
-              <w:t>MHLW Survey (static)</w:t>
-            </w:r>
-          </w:p>
-        </w:tc>
-        <w:tc>
-          <w:tcPr>
-            <w:tcW w:type="dxa" w:w="1872"/>
-          </w:tcPr>
-          <w:p>
-            <w:pPr>
-              <w:jc w:val="center"/>
-            </w:pPr>
-            <w:r>
-              <w:rPr>
-                <w:rFonts w:ascii="Times New Roman" w:hAnsi="Times New Roman"/>
-                <w:sz w:val="18"/>
-              </w:rPr>
-              <w:t>Every 3 years</w:t>
-            </w:r>
-          </w:p>
-        </w:tc>
-        <w:tc>
-          <w:tcPr>
-            <w:tcW w:type="dxa" w:w="1872"/>
-          </w:tcPr>
-          <w:p>
-            <w:pPr>
-              <w:jc w:val="center"/>
-            </w:pPr>
-            <w:r>
-              <w:rPr>
-                <w:rFonts w:ascii="Times New Roman" w:hAnsi="Times New Roman"/>
-                <w:sz w:val="18"/>
-              </w:rPr>
-              <w:t>2008-2023</w:t>
-            </w:r>
-          </w:p>
-        </w:tc>
-        <w:tc>
-          <w:tcPr>
-            <w:tcW w:type="dxa" w:w="1872"/>
-          </w:tcPr>
-          <w:p>
-            <w:pPr>
-              <w:jc w:val="center"/>
-            </w:pPr>
-            <w:r>
-              <w:rPr>
-                <w:rFonts w:ascii="Times New Roman" w:hAnsi="Times New Roman"/>
-                <w:sz w:val="18"/>
-              </w:rPr>
-              <w:t>Descriptive only</w:t>
-            </w:r>
-          </w:p>
-        </w:tc>
-      </w:tr>
-      <w:tr>
-        <w:tc>
-          <w:tcPr>
-            <w:tcW w:type="dxa" w:w="1872"/>
-          </w:tcPr>
-          <w:p>
-            <w:r>
-              <w:rPr>
-                <w:rFonts w:ascii="Times New Roman" w:hAnsi="Times New Roman"/>
-                <w:sz w:val="18"/>
-              </w:rPr>
-              <w:t>JMSR report counts</w:t>
-            </w:r>
-          </w:p>
-        </w:tc>
-        <w:tc>
-          <w:tcPr>
-            <w:tcW w:type="dxa" w:w="1872"/>
-          </w:tcPr>
-          <w:p>
-            <w:pPr>
-              <w:jc w:val="center"/>
-            </w:pPr>
-            <w:r>
-              <w:rPr>
-                <w:rFonts w:ascii="Times New Roman" w:hAnsi="Times New Roman"/>
-                <w:sz w:val="18"/>
-              </w:rPr>
-              <w:t>JMSR / MAIS</w:t>
-            </w:r>
-          </w:p>
-        </w:tc>
-        <w:tc>
-          <w:tcPr>
-            <w:tcW w:type="dxa" w:w="1872"/>
-          </w:tcPr>
-          <w:p>
-            <w:pPr>
-              <w:jc w:val="center"/>
-            </w:pPr>
-            <w:r>
-              <w:rPr>
-                <w:rFonts w:ascii="Times New Roman" w:hAnsi="Times New Roman"/>
-                <w:sz w:val="18"/>
-              </w:rPr>
-              <w:t>Annual</w:t>
-            </w:r>
-          </w:p>
-        </w:tc>
-        <w:tc>
-          <w:tcPr>
-            <w:tcW w:type="dxa" w:w="1872"/>
-          </w:tcPr>
-          <w:p>
-            <w:pPr>
-              <w:jc w:val="center"/>
-            </w:pPr>
-            <w:r>
-              <w:rPr>
-                <w:rFonts w:ascii="Times New Roman" w:hAnsi="Times New Roman"/>
-                <w:sz w:val="18"/>
-              </w:rPr>
-              <w:t>2015-2024</w:t>
-            </w:r>
-          </w:p>
-        </w:tc>
-        <w:tc>
-          <w:tcPr>
-            <w:tcW w:type="dxa" w:w="1872"/>
-          </w:tcPr>
-          <w:p>
-            <w:pPr>
-              <w:jc w:val="center"/>
-            </w:pPr>
-            <w:r>
-              <w:rPr>
-                <w:rFonts w:ascii="Times New Roman" w:hAnsi="Times New Roman"/>
-                <w:sz w:val="18"/>
-              </w:rPr>
-              <w:t>Sensitivity (2016-2024)</w:t>
-            </w:r>
-          </w:p>
-        </w:tc>
-      </w:tr>
-      <w:tr>
-        <w:tc>
-          <w:tcPr>
-            <w:tcW w:type="dxa" w:w="1872"/>
-          </w:tcPr>
-          <w:p>
-            <w:r>
-              <w:rPr>
-                <w:rFonts w:ascii="Times New Roman" w:hAnsi="Times New Roman"/>
-                <w:sz w:val="18"/>
-              </w:rPr>
-              <w:t>Newspaper article counts</w:t>
-            </w:r>
-          </w:p>
-        </w:tc>
-        <w:tc>
-          <w:tcPr>
-            <w:tcW w:type="dxa" w:w="1872"/>
-          </w:tcPr>
-          <w:p>
-            <w:pPr>
-              <w:jc w:val="center"/>
-            </w:pPr>
-            <w:r>
-              <w:rPr>
-                <w:rFonts w:ascii="Times New Roman" w:hAnsi="Times New Roman"/>
-                <w:sz w:val="18"/>
-              </w:rPr>
-              <w:t>Nikkei Telecom 21</w:t>
-            </w:r>
-          </w:p>
-        </w:tc>
-        <w:tc>
-          <w:tcPr>
-            <w:tcW w:type="dxa" w:w="1872"/>
-          </w:tcPr>
-          <w:p>
-            <w:pPr>
-              <w:jc w:val="center"/>
-            </w:pPr>
-            <w:r>
-              <w:rPr>
-                <w:rFonts w:ascii="Times New Roman" w:hAnsi="Times New Roman"/>
-                <w:sz w:val="18"/>
-              </w:rPr>
-              <w:t>Annual</w:t>
-            </w:r>
-          </w:p>
-        </w:tc>
-        <w:tc>
-          <w:tcPr>
-            <w:tcW w:type="dxa" w:w="1872"/>
-          </w:tcPr>
-          <w:p>
-            <w:pPr>
-              <w:jc w:val="center"/>
-            </w:pPr>
-            <w:r>
-              <w:rPr>
-                <w:rFonts w:ascii="Times New Roman" w:hAnsi="Times New Roman"/>
-                <w:sz w:val="18"/>
-              </w:rPr>
-              <w:t>2008-2018</w:t>
-            </w:r>
-          </w:p>
-        </w:tc>
-        <w:tc>
-          <w:tcPr>
-            <w:tcW w:type="dxa" w:w="1872"/>
-          </w:tcPr>
-          <w:p>
-            <w:pPr>
-              <w:jc w:val="center"/>
-            </w:pPr>
-            <w:r>
-              <w:rPr>
-                <w:rFonts w:ascii="Times New Roman" w:hAnsi="Times New Roman"/>
-                <w:sz w:val="18"/>
-              </w:rPr>
-              <w:t>Sensitivity (2009-2018)</w:t>
             </w:r>
           </w:p>
         </w:tc>

</xml_diff>